<commit_message>
application change land use
</commit_message>
<xml_diff>
--- a/Templates/application_change_in_land.docx
+++ b/Templates/application_change_in_land.docx
@@ -548,29 +548,7 @@
           <w:szCs w:val="28"/>
           <w:lang w:val="en-US"/>
         </w:rPr>
-        <w:t>{{FullName</w:t>
-      </w:r>
-      <w:r>
-        <w:rPr>
-          <w:rFonts w:ascii="Times New Roman" w:eastAsia="Calibri" w:hAnsi="Times New Roman" w:cs="Times New Roman"/>
-          <w:iCs/>
-          <w:color w:val="auto"/>
-          <w:sz w:val="28"/>
-          <w:szCs w:val="28"/>
-          <w:lang w:val="en-US"/>
-        </w:rPr>
-        <w:t>2</w:t>
-      </w:r>
-      <w:r>
-        <w:rPr>
-          <w:rFonts w:ascii="Times New Roman" w:eastAsia="Calibri" w:hAnsi="Times New Roman" w:cs="Times New Roman"/>
-          <w:iCs/>
-          <w:color w:val="auto"/>
-          <w:sz w:val="28"/>
-          <w:szCs w:val="28"/>
-          <w:lang w:val="en-US"/>
-        </w:rPr>
-        <w:t>}}</w:t>
+        <w:t>{{FullName2}}</w:t>
       </w:r>
     </w:p>
     <w:p>
@@ -652,18 +630,7 @@
           <w:szCs w:val="28"/>
           <w:lang w:val="en-US"/>
         </w:rPr>
-        <w:t>2</w:t>
-      </w:r>
-      <w:r>
-        <w:rPr>
-          <w:rFonts w:ascii="Times New Roman" w:eastAsia="Calibri" w:hAnsi="Times New Roman" w:cs="Times New Roman"/>
-          <w:iCs/>
-          <w:color w:val="auto"/>
-          <w:sz w:val="28"/>
-          <w:szCs w:val="28"/>
-          <w:lang w:val="en-US"/>
-        </w:rPr>
-        <w:t>}}</w:t>
+        <w:t>2}}</w:t>
       </w:r>
     </w:p>
     <w:p>
@@ -722,29 +689,7 @@
           <w:szCs w:val="28"/>
           <w:lang w:val="en-US"/>
         </w:rPr>
-        <w:t>{{Address</w:t>
-      </w:r>
-      <w:r>
-        <w:rPr>
-          <w:rFonts w:ascii="Times New Roman" w:eastAsia="Calibri" w:hAnsi="Times New Roman" w:cs="Times New Roman"/>
-          <w:iCs/>
-          <w:color w:val="auto"/>
-          <w:sz w:val="28"/>
-          <w:szCs w:val="28"/>
-          <w:lang w:val="en-US"/>
-        </w:rPr>
-        <w:t>2</w:t>
-      </w:r>
-      <w:r>
-        <w:rPr>
-          <w:rFonts w:ascii="Times New Roman" w:eastAsia="Calibri" w:hAnsi="Times New Roman" w:cs="Times New Roman"/>
-          <w:iCs/>
-          <w:color w:val="auto"/>
-          <w:sz w:val="28"/>
-          <w:szCs w:val="28"/>
-          <w:lang w:val="en-US"/>
-        </w:rPr>
-        <w:t>}}</w:t>
+        <w:t>{{Address2}}</w:t>
       </w:r>
     </w:p>
     <w:p>
@@ -816,17 +761,51 @@
           <w:szCs w:val="28"/>
           <w:lang w:val="en-US"/>
         </w:rPr>
-        <w:t>{PhoneNumber}}</w:t>
-      </w:r>
-      <w:r>
-        <w:rPr>
-          <w:rFonts w:ascii="Times New Roman" w:eastAsia="Calibri" w:hAnsi="Times New Roman" w:cs="Times New Roman"/>
-          <w:iCs/>
-          <w:color w:val="auto"/>
-          <w:sz w:val="28"/>
-          <w:szCs w:val="28"/>
-        </w:rPr>
-        <w:t xml:space="preserve"> Hộp thư điện tử (nếu có): </w:t>
+        <w:t>{PhoneNumber</w:t>
+      </w:r>
+      <w:proofErr w:type="gramStart"/>
+      <w:r>
+        <w:rPr>
+          <w:rFonts w:ascii="Times New Roman" w:eastAsia="Calibri" w:hAnsi="Times New Roman" w:cs="Times New Roman"/>
+          <w:iCs/>
+          <w:color w:val="auto"/>
+          <w:sz w:val="28"/>
+          <w:szCs w:val="28"/>
+          <w:lang w:val="en-US"/>
+        </w:rPr>
+        <w:t>}}</w:t>
+      </w:r>
+      <w:r>
+        <w:rPr>
+          <w:rFonts w:ascii="Times New Roman" w:eastAsia="Calibri" w:hAnsi="Times New Roman" w:cs="Times New Roman"/>
+          <w:iCs/>
+          <w:color w:val="auto"/>
+          <w:sz w:val="28"/>
+          <w:szCs w:val="28"/>
+          <w:lang w:val="en-US"/>
+        </w:rPr>
+        <w:t xml:space="preserve">  </w:t>
+      </w:r>
+      <w:r>
+        <w:rPr>
+          <w:rFonts w:ascii="Times New Roman" w:eastAsia="Calibri" w:hAnsi="Times New Roman" w:cs="Times New Roman"/>
+          <w:iCs/>
+          <w:color w:val="auto"/>
+          <w:sz w:val="28"/>
+          <w:szCs w:val="28"/>
+        </w:rPr>
+        <w:t xml:space="preserve"> </w:t>
+      </w:r>
+      <w:proofErr w:type="gramEnd"/>
+      <w:r>
+        <w:rPr>
+          <w:rFonts w:ascii="Times New Roman" w:eastAsia="Calibri" w:hAnsi="Times New Roman" w:cs="Times New Roman"/>
+          <w:iCs/>
+          <w:color w:val="auto"/>
+          <w:sz w:val="28"/>
+          <w:szCs w:val="28"/>
+        </w:rPr>
+        <w:t xml:space="preserve">Hộp thư điện tử (nếu có): </w:t>
       </w:r>
       <w:r>
         <w:rPr>
@@ -2103,6 +2082,7 @@
   <w:style w:type="character" w:default="1" w:styleId="DefaultParagraphFont">
     <w:name w:val="Default Paragraph Font"/>
     <w:uiPriority w:val="1"/>
+    <w:semiHidden/>
     <w:unhideWhenUsed/>
   </w:style>
   <w:style w:type="table" w:default="1" w:styleId="TableNormal">

</xml_diff>